<commit_message>
Clarify memoir finalization inputs
</commit_message>
<xml_diff>
--- a/MEMOIRE_STOCKFLOW_BROUILLON.docx
+++ b/MEMOIRE_STOCKFLOW_BROUILLON.docx
@@ -84,6 +84,81 @@
     </w:p>
     <w:p/>
     <w:p>
+      <w:pPr>
+        <w:pStyle w:val="Heading1"/>
+      </w:pPr>
+      <w:r>
+        <w:t>Informations à compléter avant la version finale</w:t>
+      </w:r>
+    </w:p>
+    <w:p/>
+    <w:p>
+      <w:pPr>
+        <w:pStyle w:val="Normal"/>
+      </w:pPr>
+      <w:r>
+        <w:t>Pour produire une version définitive conforme aux attentes de l'établissement, les informations suivantes doivent être précisées :</w:t>
+      </w:r>
+    </w:p>
+    <w:p/>
+    <w:p>
+      <w:pPr>
+        <w:pStyle w:val="ListParagraph"/>
+      </w:pPr>
+      <w:r>
+        <w:t>• nom complet de l'auteur ;</w:t>
+      </w:r>
+    </w:p>
+    <w:p>
+      <w:pPr>
+        <w:pStyle w:val="ListParagraph"/>
+      </w:pPr>
+      <w:r>
+        <w:t>• nom de l'établissement ;</w:t>
+      </w:r>
+    </w:p>
+    <w:p>
+      <w:pPr>
+        <w:pStyle w:val="ListParagraph"/>
+      </w:pPr>
+      <w:r>
+        <w:t>• filière ou spécialité ;</w:t>
+      </w:r>
+    </w:p>
+    <w:p>
+      <w:pPr>
+        <w:pStyle w:val="ListParagraph"/>
+      </w:pPr>
+      <w:r>
+        <w:t>• nom de l'encadreur ;</w:t>
+      </w:r>
+    </w:p>
+    <w:p>
+      <w:pPr>
+        <w:pStyle w:val="ListParagraph"/>
+      </w:pPr>
+      <w:r>
+        <w:t>• année académique exacte ;</w:t>
+      </w:r>
+    </w:p>
+    <w:p>
+      <w:pPr>
+        <w:pStyle w:val="ListParagraph"/>
+      </w:pPr>
+      <w:r>
+        <w:t>• exigences de mise en page imposées par l'école, si elles existent ;</w:t>
+      </w:r>
+    </w:p>
+    <w:p>
+      <w:pPr>
+        <w:pStyle w:val="ListParagraph"/>
+      </w:pPr>
+      <w:r>
+        <w:t>• intitulé officiel à conserver pour le sujet.</w:t>
+      </w:r>
+    </w:p>
+    <w:p/>
+    <w:p>
       <w:r>
         <w:br w:type="page"/>
       </w:r>
@@ -4003,7 +4078,6 @@
         <w:t>• schéma de la couche analytique.</w:t>
       </w:r>
     </w:p>
-    <w:p/>
     <w:sectPr>
       <w:pgSz w:w="11906" w:h="16838"/>
       <w:pgMar w:top="1440" w:right="1440" w:bottom="1440" w:left="1440" w:header="720" w:footer="720" w:gutter="0"/>

</xml_diff>